<commit_message>
Homework 9 now produces a test plan as well as test cases
SRS template section 7 rebuilt as 7.1 Test Plan, 7.2 Test Cases and
7.3 Validation Criteria, so the module outcome about writing a system
test plan has an actual deliverable. Lesson 3's planning slide points
forward to it; Lesson 10's homework slide and the brief cover both parts.
</commit_message>
<xml_diff>
--- a/materials/Software Requirements Specification (SRS) Document Template.docx
+++ b/materials/Software Requirements Specification (SRS) Document Template.docx
@@ -14,17 +14,7 @@
           <w:b/>
         </w:rPr>
         <w:t>Software Requirements Specification (SRS) Document</w:t>
-      </w:r>
-      <w:r>
-        <w:rPr>
-          <w:b/>
-        </w:rPr>
         <w:br/>
-      </w:r>
-      <w:r>
-        <w:rPr>
-          <w:b/>
-        </w:rPr>
         <w:t>Cinema Web Application</w:t>
       </w:r>
     </w:p>
@@ -62,11 +52,6 @@
           <w:b/>
         </w:rPr>
         <w:t>1.1 Purpose</w:t>
-      </w:r>
-      <w:r>
-        <w:rPr>
-          <w:b/>
-        </w:rPr>
         <w:br/>
       </w:r>
       <w:r>
@@ -82,11 +67,6 @@
           <w:b/>
         </w:rPr>
         <w:t>1.2 Scope</w:t>
-      </w:r>
-      <w:r>
-        <w:rPr>
-          <w:b/>
-        </w:rPr>
         <w:br/>
       </w:r>
       <w:r>
@@ -127,11 +107,6 @@
           <w:b/>
         </w:rPr>
         <w:t>2.1 Product Perspective</w:t>
-      </w:r>
-      <w:r>
-        <w:rPr>
-          <w:b/>
-        </w:rPr>
         <w:br/>
       </w:r>
       <w:r>
@@ -320,11 +295,6 @@
           <w:b/>
         </w:rPr>
         <w:t>2.4 Operating Environment</w:t>
-      </w:r>
-      <w:r>
-        <w:rPr>
-          <w:b/>
-        </w:rPr>
         <w:br/>
       </w:r>
       <w:r>
@@ -348,11 +318,6 @@
           <w:b/>
         </w:rPr>
         <w:t>2.5 Design and Implementation Constraints</w:t>
-      </w:r>
-      <w:r>
-        <w:rPr>
-          <w:b/>
-        </w:rPr>
         <w:br/>
       </w:r>
       <w:r>
@@ -401,11 +366,6 @@
           <w:b/>
         </w:rPr>
         <w:t>3.1 Movie Listings</w:t>
-      </w:r>
-      <w:r>
-        <w:rPr>
-          <w:b/>
-        </w:rPr>
         <w:br/>
       </w:r>
       <w:r>
@@ -467,11 +427,6 @@
           <w:b/>
         </w:rPr>
         <w:t>3.2 Session Management</w:t>
-      </w:r>
-      <w:r>
-        <w:rPr>
-          <w:b/>
-        </w:rPr>
         <w:br/>
       </w:r>
       <w:r>
@@ -674,14 +629,7 @@
           <w:b w:val="1"/>
           <w:bCs w:val="1"/>
         </w:rPr>
-        <w:t xml:space="preserve">4.6 </w:t>
-      </w:r>
-      <w:r>
-        <w:rPr>
-          <w:b w:val="1"/>
-          <w:bCs w:val="1"/>
-        </w:rPr>
-        <w:t>Legal and Compliance</w:t>
+        <w:t xml:space="preserve">4.6 Legal and Compliance</w:t>
       </w:r>
     </w:p>
     <w:p>
@@ -742,11 +690,6 @@
           <w:b/>
         </w:rPr>
         <w:t>5.1 Use Case Diagram</w:t>
-      </w:r>
-      <w:r>
-        <w:rPr>
-          <w:b/>
-        </w:rPr>
         <w:br/>
       </w:r>
       <w:r>
@@ -762,11 +705,6 @@
           <w:b/>
         </w:rPr>
         <w:t>5.2 Sequence Diagrams</w:t>
-      </w:r>
-      <w:r>
-        <w:rPr>
-          <w:b/>
-        </w:rPr>
         <w:br/>
       </w:r>
       <w:r>
@@ -782,11 +720,6 @@
           <w:b/>
         </w:rPr>
         <w:t>5.3 Data Flow Diagrams</w:t>
-      </w:r>
-      <w:r>
-        <w:rPr>
-          <w:b/>
-        </w:rPr>
         <w:br/>
       </w:r>
       <w:r>
@@ -970,52 +903,294 @@
     </w:p>
     <w:p>
       <w:pPr>
-        <w:spacing w:before="240" w:after="240"/>
-        <w:rPr>
-          <w:b/>
-        </w:rPr>
-      </w:pPr>
-      <w:r>
-        <w:rPr>
-          <w:b/>
-        </w:rPr>
-        <w:t>7.1 Test Case</w:t>
-      </w:r>
-    </w:p>
-    <w:p>
-      <w:pPr>
-        <w:spacing w:before="240" w:after="240"/>
-        <w:rPr>
-          <w:b/>
-        </w:rPr>
-      </w:pPr>
-      <w:r>
-        <w:t>[Fill in…]</w:t>
-      </w:r>
-    </w:p>
-    <w:p>
-      <w:pPr>
-        <w:spacing w:before="240" w:after="240"/>
-        <w:rPr>
-          <w:b/>
-        </w:rPr>
-      </w:pPr>
-      <w:r>
-        <w:rPr>
-          <w:b/>
-        </w:rPr>
-        <w:t>7.2 Validation Criteria</w:t>
-      </w:r>
-    </w:p>
-    <w:p>
-      <w:pPr>
-        <w:spacing w:before="240" w:after="240"/>
-        <w:rPr>
-          <w:b/>
-        </w:rPr>
-      </w:pPr>
-      <w:r>
-        <w:t>[Fill in…]</w:t>
+        <w:spacing w:before="240" w:after="120"/>
+        <w:rPr>
+          <w:b/>
+        </w:rPr>
+      </w:pPr>
+      <w:r>
+        <w:rPr>
+          <w:b/>
+        </w:rPr>
+        <w:t xml:space="preserve">7.1 Test Plan</w:t>
+      </w:r>
+    </w:p>
+    <w:p>
+      <w:pPr>
+        <w:spacing w:before="0" w:after="120"/>
+        <w:rPr>
+          <w:i/>
+        </w:rPr>
+      </w:pPr>
+      <w:r>
+        <w:rPr>
+          <w:i/>
+          <w:color w:val="595959"/>
+        </w:rPr>
+        <w:t xml:space="preserve">The test plan says what will be tested, how, and when testing is finished. Keep it to one page.</w:t>
+      </w:r>
+    </w:p>
+    <w:p>
+      <w:pPr>
+        <w:spacing w:before="0" w:after="100"/>
+        <w:ind w:left="360"/>
+      </w:pPr>
+      <w:r>
+        <w:rPr>
+          <w:b/>
+        </w:rPr>
+        <w:t xml:space="preserve">Scope of testing — </w:t>
+      </w:r>
+      <w:r>
+        <w:rPr>
+          <w:color w:val="595959"/>
+        </w:rPr>
+        <w:t xml:space="preserve">which parts of the system this plan covers, and at which test level </w:t>
+      </w:r>
+      <w:r>
+        <w:t xml:space="preserve">[Fill in…]</w:t>
+      </w:r>
+    </w:p>
+    <w:p>
+      <w:pPr>
+        <w:spacing w:before="0" w:after="100"/>
+        <w:ind w:left="360"/>
+      </w:pPr>
+      <w:r>
+        <w:rPr>
+          <w:b/>
+        </w:rPr>
+        <w:t xml:space="preserve">Features to be tested — </w:t>
+      </w:r>
+      <w:r>
+        <w:rPr>
+          <w:color w:val="595959"/>
+        </w:rPr>
+        <w:t xml:space="preserve">listed explicitly, traceable back to the functional requirements in section 3 </w:t>
+      </w:r>
+      <w:r>
+        <w:t xml:space="preserve">[Fill in…]</w:t>
+      </w:r>
+    </w:p>
+    <w:p>
+      <w:pPr>
+        <w:spacing w:before="0" w:after="100"/>
+        <w:ind w:left="360"/>
+      </w:pPr>
+      <w:r>
+        <w:rPr>
+          <w:b/>
+        </w:rPr>
+        <w:t xml:space="preserve">Features not to be tested — </w:t>
+      </w:r>
+      <w:r>
+        <w:rPr>
+          <w:color w:val="595959"/>
+        </w:rPr>
+        <w:t xml:space="preserve">and why — this is the section that protects you later </w:t>
+      </w:r>
+      <w:r>
+        <w:t xml:space="preserve">[Fill in…]</w:t>
+      </w:r>
+    </w:p>
+    <w:p>
+      <w:pPr>
+        <w:spacing w:before="0" w:after="100"/>
+        <w:ind w:left="360"/>
+      </w:pPr>
+      <w:r>
+        <w:rPr>
+          <w:b/>
+        </w:rPr>
+        <w:t xml:space="preserve">Test approach — </w:t>
+      </w:r>
+      <w:r>
+        <w:rPr>
+          <w:color w:val="595959"/>
+        </w:rPr>
+        <w:t xml:space="preserve">which techniques you will use: equivalence partitioning, boundary value analysis, decision tables, state transition, exploratory sessions; manual or automated </w:t>
+      </w:r>
+      <w:r>
+        <w:t xml:space="preserve">[Fill in…]</w:t>
+      </w:r>
+    </w:p>
+    <w:p>
+      <w:pPr>
+        <w:spacing w:before="0" w:after="100"/>
+        <w:ind w:left="360"/>
+      </w:pPr>
+      <w:r>
+        <w:rPr>
+          <w:b/>
+        </w:rPr>
+        <w:t xml:space="preserve">Entry criteria — </w:t>
+      </w:r>
+      <w:r>
+        <w:rPr>
+          <w:color w:val="595959"/>
+        </w:rPr>
+        <w:t xml:space="preserve">what must be true before testing can start </w:t>
+      </w:r>
+      <w:r>
+        <w:t xml:space="preserve">[Fill in…]</w:t>
+      </w:r>
+    </w:p>
+    <w:p>
+      <w:pPr>
+        <w:spacing w:before="0" w:after="100"/>
+        <w:ind w:left="360"/>
+      </w:pPr>
+      <w:r>
+        <w:rPr>
+          <w:b/>
+        </w:rPr>
+        <w:t xml:space="preserve">Exit criteria — </w:t>
+      </w:r>
+      <w:r>
+        <w:rPr>
+          <w:color w:val="595959"/>
+        </w:rPr>
+        <w:t xml:space="preserve">when is testing finished — e.g. all planned test cases executed, no open Critical or Major defects </w:t>
+      </w:r>
+      <w:r>
+        <w:t xml:space="preserve">[Fill in…]</w:t>
+      </w:r>
+    </w:p>
+    <w:p>
+      <w:pPr>
+        <w:spacing w:before="0" w:after="100"/>
+        <w:ind w:left="360"/>
+      </w:pPr>
+      <w:r>
+        <w:rPr>
+          <w:b/>
+        </w:rPr>
+        <w:t xml:space="preserve">Test environment and test data — </w:t>
+      </w:r>
+      <w:r>
+        <w:rPr>
+          <w:color w:val="595959"/>
+        </w:rPr>
+        <w:t xml:space="preserve">which environment, which accounts, which data set </w:t>
+      </w:r>
+      <w:r>
+        <w:t xml:space="preserve">[Fill in…]</w:t>
+      </w:r>
+    </w:p>
+    <w:p>
+      <w:pPr>
+        <w:spacing w:before="0" w:after="100"/>
+        <w:ind w:left="360"/>
+      </w:pPr>
+      <w:r>
+        <w:rPr>
+          <w:b/>
+        </w:rPr>
+        <w:t xml:space="preserve">Risks and mitigations — </w:t>
+      </w:r>
+      <w:r>
+        <w:rPr>
+          <w:color w:val="595959"/>
+        </w:rPr>
+        <w:t xml:space="preserve">what could stop testing, and what you will do about it </w:t>
+      </w:r>
+      <w:r>
+        <w:t xml:space="preserve">[Fill in…]</w:t>
+      </w:r>
+    </w:p>
+    <w:p>
+      <w:pPr>
+        <w:spacing w:before="0" w:after="100"/>
+        <w:ind w:left="360"/>
+      </w:pPr>
+      <w:r>
+        <w:rPr>
+          <w:b/>
+        </w:rPr>
+        <w:t xml:space="preserve">Deliverables and schedule — </w:t>
+      </w:r>
+      <w:r>
+        <w:rPr>
+          <w:color w:val="595959"/>
+        </w:rPr>
+        <w:t xml:space="preserve">test cases, defect log, test report — and by when </w:t>
+      </w:r>
+      <w:r>
+        <w:t xml:space="preserve">[Fill in…]</w:t>
+      </w:r>
+    </w:p>
+    <w:p>
+      <w:pPr>
+        <w:spacing w:before="240" w:after="120"/>
+        <w:rPr>
+          <w:b/>
+        </w:rPr>
+      </w:pPr>
+      <w:r>
+        <w:rPr>
+          <w:b/>
+        </w:rPr>
+        <w:t xml:space="preserve">7.2 Test Cases</w:t>
+      </w:r>
+    </w:p>
+    <w:p>
+      <w:pPr>
+        <w:spacing w:before="0" w:after="120"/>
+        <w:rPr>
+          <w:i/>
+        </w:rPr>
+      </w:pPr>
+      <w:r>
+        <w:rPr>
+          <w:i/>
+          <w:color w:val="595959"/>
+        </w:rPr>
+        <w:t xml:space="preserve">One test case per row. Every functional requirement in section 3 must be covered by at least one test case, and every test case must name the requirement it verifies.</w:t>
+      </w:r>
+    </w:p>
+    <w:p>
+      <w:pPr>
+        <w:spacing w:before="0" w:after="120"/>
+        <w:rPr>
+          <w:i/>
+        </w:rPr>
+      </w:pPr>
+      <w:r>
+        <w:rPr>
+          <w:i/>
+          <w:color w:val="595959"/>
+        </w:rPr>
+        <w:t xml:space="preserve">ID and title · description and requirement covered · preconditions · numbered steps · test data · expected results · postconditions · status (Pass / Fail / Blocked / Not executed)</w:t>
+      </w:r>
+    </w:p>
+    <w:p>
+      <w:pPr>
+        <w:spacing w:before="0" w:after="240"/>
+      </w:pPr>
+      <w:r>
+        <w:t xml:space="preserve">[Fill in…]</w:t>
+      </w:r>
+    </w:p>
+    <w:p>
+      <w:pPr>
+        <w:spacing w:before="240" w:after="120"/>
+        <w:rPr>
+          <w:b/>
+        </w:rPr>
+      </w:pPr>
+      <w:r>
+        <w:rPr>
+          <w:b/>
+        </w:rPr>
+        <w:t xml:space="preserve">7.3 Validation Criteria</w:t>
+      </w:r>
+    </w:p>
+    <w:p>
+      <w:pPr>
+        <w:spacing w:before="0" w:after="240"/>
+      </w:pPr>
+      <w:r>
+        <w:t xml:space="preserve">[Fill in…]</w:t>
       </w:r>
     </w:p>
     <w:p>
@@ -1170,15 +1345,7 @@
       </w:pPr>
       <w:r>
         <w:rPr/>
-        <w:t>GDPR: General Data Protection Regulation</w:t>
-      </w:r>
-      <w:r>
-        <w:rPr/>
-        <w:t xml:space="preserve"> </w:t>
-      </w:r>
-      <w:r>
-        <w:rPr/>
-        <w:t>BBQ</w:t>
+        <w:t xml:space="preserve">GDPR: General Data Protection Regulation BBQ</w:t>
       </w:r>
     </w:p>
     <w:p>

</xml_diff>